<commit_message>
Record Screaming Frog, schema/structured data, and ClickUp experience; update Awayday package
Master profile updated with all three confirmations. Awayday resume, cover letter,
fit score (62 -> 71), and match report revised accordingly.

Co-Authored-By: Claude Opus 5 <noreply@anthropic.com>
Claude-Session: https://claude.ai/code/session_012bgCHkXVGvrCAAv9cv5gL6
</commit_message>
<xml_diff>
--- a/applications/awayday-seo-content-specialist/Rotenberg Cover Letter - Awayday - SEO Content Specialist.docx
+++ b/applications/awayday-seo-content-specialist/Rotenberg Cover Letter - Awayday - SEO Content Specialist.docx
@@ -94,7 +94,7 @@
           <w:b w:val="0"/>
           <w:color w:val="1A1A1A"/>
         </w:rPr>
-        <w:t>I'm applying for the SEO Content Specialist role. Most of what this role asks for is my daily practice at Solenzo: technical SEO audits, keyword and SERP research, and on-page work - titles, meta descriptions, internal linking, alt text - implemented directly rather than handed off. I write the content myself, thought leadership, guides, and landing pages, and I build reusable templates so each new piece isn't started from scratch, which is the same discipline your posting describes for blog, hub, and promotional page templates.</w:t>
+        <w:t>I'm applying for the SEO Content Specialist role. Most of what this role asks for is my daily practice at Solenzo: technical SEO audits using Screaming Frog for site-wide data pulls, keyword and SERP research, and on-page work - titles, meta descriptions, internal linking, alt text, and schema/structured data - implemented directly rather than handed off. I write the content myself, thought leadership, guides, and landing pages, and I build reusable templates so each new piece isn't started from scratch, which is the same discipline your posting describes for blog, hub, and promotional page templates.</w:t>
       </w:r>
     </w:p>
     <w:p>
@@ -107,7 +107,7 @@
           <w:b w:val="0"/>
           <w:color w:val="1A1A1A"/>
         </w:rPr>
-        <w:t>I use Claude and ChatGPT inside real production workflows, not as an experiment, and I've built and documented SOPs for marketing processes so work stays consistent across concurrent client engagements - the same operational habit your posting asks for around content systems and documentation. At Wix I managed a team of onboarding specialists and gave structured feedback to improve individual output, which is the closest experience I have to the writer-management side of this role, though I should be direct that I have not personally managed a roster of freelance writers the way this posting describes.</w:t>
+        <w:t>I use Claude and ChatGPT inside real production workflows, not as an experiment, and I've built and documented SOPs for marketing processes so work stays consistent across concurrent client engagements - the same operational habit your posting asks for around content systems and documentation. I've also managed workflows in ClickUp directly at a prior agency role. At Wix I managed a team of onboarding specialists and gave structured feedback to improve individual output, which is the closest experience I have to the writer-management side of this role, though I should be direct that I have not personally managed a roster of freelance writers the way this posting describes.</w:t>
       </w:r>
     </w:p>
     <w:p>
@@ -120,7 +120,7 @@
           <w:b w:val="0"/>
           <w:color w:val="1A1A1A"/>
         </w:rPr>
-        <w:t>I'll also note two other gaps rather than gloss over them: I haven't implemented schema/structured data specifically, and I don't have hospitality or vacation-rental industry experience, though I have run SEO and content for local service businesses in a similarly execution-heavy, fast-turnaround environment. I'd welcome the conversation.</w:t>
+        <w:t>I'll also note two remaining gaps rather than gloss over them: my writer-management experience is from managing and coaching a team at Wix rather than a roster of freelance writers specifically, and I don't have hospitality or vacation-rental industry experience, though I've run SEO and content for local service businesses in a similarly execution-heavy, fast-turnaround environment. I'd welcome the conversation.</w:t>
       </w:r>
     </w:p>
     <w:p>

</xml_diff>